<commit_message>
feat(P4): Enterprise AI Governance & Technical Lifecycle
</commit_message>
<xml_diff>
--- a/04-ai-governance-and-technical-lifecycle/artifacts/A-04_AI_System_Profile.docx
+++ b/04-ai-governance-and-technical-lifecycle/artifacts/A-04_AI_System_Profile.docx
@@ -1749,6 +1749,33 @@
                 <w:sz w:val="18"/>
               </w:rPr>
               <w:t>Affected Population</w:t>
+            </w:r>
+            <w:r>
+              <w:rPr>
+                <w:rFonts w:ascii="Calibri" w:hAnsi="Calibri"/>
+                <w:b/>
+                <w:color w:val="1F3864"/>
+                <w:sz w:val="18"/>
+              </w:rPr>
+              <w:t xml:space="preserve"> (</w:t>
+            </w:r>
+            <w:r>
+              <w:rPr>
+                <w:rFonts w:ascii="Calibri" w:hAnsi="Calibri"/>
+                <w:b/>
+                <w:color w:val="1F3864"/>
+                <w:sz w:val="18"/>
+              </w:rPr>
+              <w:t>scenario parameter</w:t>
+            </w:r>
+            <w:r>
+              <w:rPr>
+                <w:rFonts w:ascii="Calibri" w:hAnsi="Calibri"/>
+                <w:b/>
+                <w:color w:val="1F3864"/>
+                <w:sz w:val="18"/>
+              </w:rPr>
+              <w:t>)</w:t>
             </w:r>
           </w:p>
         </w:tc>
@@ -8121,7 +8148,6 @@
   <w:style w:type="character" w:default="1" w:styleId="DefaultParagraphFont">
     <w:name w:val="Default Paragraph Font"/>
     <w:uiPriority w:val="1"/>
-    <w:semiHidden/>
     <w:unhideWhenUsed/>
   </w:style>
   <w:style w:type="table" w:default="1" w:styleId="TableNormal">

</xml_diff>